<commit_message>
ChessMaze v09.5 the developming TryMove functionality
</commit_message>
<xml_diff>
--- a/docs/Feature cards draft.docx
+++ b/docs/Feature cards draft.docx
@@ -76,7 +76,13 @@
               <w:t>When</w:t>
             </w:r>
             <w:r>
-              <w:t xml:space="preserve"> initial state is called, the applications sets up the minimum components necessary for the game to function. When the player requests for an initial state after an existing game has finished, the application will setup components back to default which will reset the game. If the player does not request for a new game, the existing game no longer functions, and all further movement requests will return GameAlreadyCompleted. The core </w:t>
+              <w:t xml:space="preserve"> initial state is called, the applications </w:t>
+            </w:r>
+            <w:r>
+              <w:t>set</w:t>
+            </w:r>
+            <w:r>
+              <w:t xml:space="preserve"> up the minimum components necessary for the game to function. When the player requests for an initial state after an existing game has finished, the application will setup components back to default which will reset the game. If the player does not request for a new game, the existing game no longer functions, and all further movement requests will return GameAlreadyCompleted. The core </w:t>
             </w:r>
             <w:r>
               <w:rPr>
@@ -138,13 +144,22 @@
               <w:t>OutOfBounds</w:t>
             </w:r>
             <w:r>
-              <w:t xml:space="preserve"> is returned. However if the destination square is a legal move, is inbounds and is not blocked, and if bishop is present in the square,  </w:t>
+              <w:t xml:space="preserve"> is returned. </w:t>
+            </w:r>
+            <w:r>
+              <w:t>However,</w:t>
+            </w:r>
+            <w:r>
+              <w:t xml:space="preserve"> if the destination square is a legal move, is inbounds and is not blocked, and if bishop is present in the </w:t>
+            </w:r>
+            <w:r>
+              <w:t>square, then</w:t>
             </w:r>
             <w:r>
               <w:rPr>
                 <w:rFonts w:hint="eastAsia"/>
               </w:rPr>
-              <w:t>then Success is returned, the current position changes and one Rook move is added to</w:t>
+              <w:t xml:space="preserve"> Success is returned, the current position changes and one Rook move is added to</w:t>
             </w:r>
             <w:r>
               <w:t xml:space="preserve"> </w:t>
@@ -161,7 +176,13 @@
           </w:p>
           <w:p>
             <w:r>
-              <w:t>The position moves only if Success is returned, and remains unchanged for all other outcomes.</w:t>
+              <w:t xml:space="preserve">The position moves only if Success is </w:t>
+            </w:r>
+            <w:r>
+              <w:t>returned and</w:t>
+            </w:r>
+            <w:r>
+              <w:t xml:space="preserve"> remains unchanged for all other outcomes.</w:t>
             </w:r>
           </w:p>
           <w:p/>
@@ -198,31 +219,13 @@
           </w:tcPr>
           <w:p>
             <w:r>
-              <w:t xml:space="preserve">If the player is on a </w:t>
-            </w:r>
-            <w:r>
-              <w:t>Bishop</w:t>
-            </w:r>
-            <w:r>
-              <w:t xml:space="preserve"> square, the legal moves are any </w:t>
-            </w:r>
-            <w:r>
-              <w:t>straight diagonal</w:t>
-            </w:r>
-            <w:r>
-              <w:t xml:space="preserve"> movements from the current position. </w:t>
-            </w:r>
-          </w:p>
-          <w:p/>
-          <w:p>
-            <w:r>
-              <w:t xml:space="preserve">If the player attempts to move to a square that isn’t a legal </w:t>
-            </w:r>
-            <w:r>
-              <w:t>bishop</w:t>
-            </w:r>
-            <w:r>
-              <w:t xml:space="preserve"> move, </w:t>
+              <w:t xml:space="preserve">If the player is on a Bishop square, the legal moves are any straight diagonal movements from the current position. </w:t>
+            </w:r>
+          </w:p>
+          <w:p/>
+          <w:p>
+            <w:r>
+              <w:t xml:space="preserve">If the player attempts to move to a square that isn’t a legal bishop move, </w:t>
             </w:r>
             <w:r>
               <w:t>InvalidMovement</w:t>
@@ -234,13 +237,16 @@
               <w:t>OutOfBounds</w:t>
             </w:r>
             <w:r>
-              <w:t xml:space="preserve"> is returned. However if the destination square is a legal move, is inbounds and is not blocked, and if bishop is present in the square,  </w:t>
+              <w:t xml:space="preserve"> is returned. However if the destination square is a legal move, is inbounds and is not blocked, and if bishop is present in the </w:t>
+            </w:r>
+            <w:r>
+              <w:t>square, then</w:t>
             </w:r>
             <w:r>
               <w:rPr>
                 <w:rFonts w:hint="eastAsia"/>
               </w:rPr>
-              <w:t xml:space="preserve">then Success is returned, the current position changes and one </w:t>
+              <w:t xml:space="preserve"> Success is returned, the current position changes and one </w:t>
             </w:r>
             <w:r>
               <w:t xml:space="preserve">bishop </w:t>
@@ -294,29 +300,26 @@
           </w:tcPr>
           <w:p>
             <w:r>
-              <w:t xml:space="preserve">If the player is on a Bishop square, the legal moves are any </w:t>
-            </w:r>
-            <w:r>
-              <w:t>squares that are two</w:t>
-            </w:r>
-            <w:r>
-              <w:t xml:space="preserve"> squares on one axis and one on the other </w:t>
-            </w:r>
-            <w:r>
-              <w:t xml:space="preserve"> from the current position. </w:t>
-            </w:r>
-          </w:p>
-          <w:p/>
-          <w:p/>
-          <w:p>
-            <w:r>
-              <w:t xml:space="preserve">If the player attempts to move to a square that isn’t a legal </w:t>
-            </w:r>
-            <w:r>
-              <w:t>knight</w:t>
-            </w:r>
-            <w:r>
-              <w:t xml:space="preserve"> move, </w:t>
+              <w:t>If the player is on a Bishop square, the legal moves are any squares that are two</w:t>
+            </w:r>
+            <w:r>
+              <w:t xml:space="preserve"> squares on one axis and one on the </w:t>
+            </w:r>
+            <w:r>
+              <w:t xml:space="preserve">other </w:t>
+            </w:r>
+            <w:r>
+              <w:t>from</w:t>
+            </w:r>
+            <w:r>
+              <w:t xml:space="preserve"> the current position. </w:t>
+            </w:r>
+          </w:p>
+          <w:p/>
+          <w:p/>
+          <w:p>
+            <w:r>
+              <w:t xml:space="preserve">If the player attempts to move to a square that isn’t a legal knight move, </w:t>
             </w:r>
             <w:r>
               <w:t>InvalidMovement</w:t>
@@ -328,19 +331,19 @@
               <w:t>OutOfBounds</w:t>
             </w:r>
             <w:r>
-              <w:t xml:space="preserve"> is returned. However if the destination square is a legal move, is inbounds and is not blocked, and if bishop is present in the square,  </w:t>
+              <w:t xml:space="preserve"> is returned. However if the destination square is a legal move, is inbounds and is not blocked, and if bishop is present in the </w:t>
+            </w:r>
+            <w:r>
+              <w:t>square, then</w:t>
             </w:r>
             <w:r>
               <w:rPr>
                 <w:rFonts w:hint="eastAsia"/>
               </w:rPr>
-              <w:t xml:space="preserve">then Success is returned, the current position changes and one </w:t>
-            </w:r>
-            <w:r>
-              <w:t>knight</w:t>
-            </w:r>
-            <w:r>
-              <w:t xml:space="preserve"> </w:t>
+              <w:t xml:space="preserve"> Success is returned, the current position changes and one </w:t>
+            </w:r>
+            <w:r>
+              <w:t xml:space="preserve">knight </w:t>
             </w:r>
             <w:r>
               <w:rPr>
@@ -363,7 +366,13 @@
           </w:p>
           <w:p>
             <w:r>
-              <w:t>The position moves only if Success is returned, and remains unchanged for all other outcomes.</w:t>
+              <w:t xml:space="preserve">The position moves only if Success is </w:t>
+            </w:r>
+            <w:r>
+              <w:t>returned and</w:t>
+            </w:r>
+            <w:r>
+              <w:t xml:space="preserve"> remains unchanged for all other outcomes.</w:t>
             </w:r>
           </w:p>
           <w:p/>
@@ -400,22 +409,13 @@
           </w:tcPr>
           <w:p>
             <w:r>
-              <w:t xml:space="preserve">If the player is on a </w:t>
-            </w:r>
-            <w:r>
-              <w:t>King</w:t>
-            </w:r>
-            <w:r>
-              <w:t xml:space="preserve"> square, the legal moves are any squares that </w:t>
-            </w:r>
-            <w:r>
-              <w:t>is e</w:t>
-            </w:r>
-            <w:r>
-              <w:t>xactly one square horizontally, vertically or diagonally</w:t>
-            </w:r>
-            <w:r>
-              <w:t xml:space="preserve"> </w:t>
+              <w:t>If the player is on a King square, the legal moves are any squares that is e</w:t>
+            </w:r>
+            <w:r>
+              <w:t xml:space="preserve">xactly one square horizontally, vertically or </w:t>
+            </w:r>
+            <w:r>
+              <w:t>diagonally</w:t>
             </w:r>
             <w:r>
               <w:t>.</w:t>
@@ -437,13 +437,16 @@
               <w:t>OutOfBounds</w:t>
             </w:r>
             <w:r>
-              <w:t xml:space="preserve"> is returned. However if the destination square is a legal move, is inbounds and is not blocked, and if bishop is present in the square,  </w:t>
+              <w:t xml:space="preserve"> is returned. However if the destination square is a legal move, is inbounds and is not blocked, and if bishop is present in the </w:t>
+            </w:r>
+            <w:r>
+              <w:t>square, then</w:t>
             </w:r>
             <w:r>
               <w:rPr>
                 <w:rFonts w:hint="eastAsia"/>
               </w:rPr>
-              <w:t xml:space="preserve">then Success is returned, the current position changes and one </w:t>
+              <w:t xml:space="preserve"> Success is returned, the current position changes and one </w:t>
             </w:r>
             <w:r>
               <w:t xml:space="preserve">knight </w:t>
@@ -469,7 +472,13 @@
           </w:p>
           <w:p>
             <w:r>
-              <w:t>The position moves only if Success is returned, and remains unchanged for all other outcomes.</w:t>
+              <w:t xml:space="preserve">The position moves only if Success is </w:t>
+            </w:r>
+            <w:r>
+              <w:t>returned and</w:t>
+            </w:r>
+            <w:r>
+              <w:t xml:space="preserve"> remains unchanged for all other outcomes.</w:t>
             </w:r>
           </w:p>
           <w:p/>
@@ -1260,6 +1269,7 @@
   <w:style w:type="character" w:default="1" w:styleId="DefaultParagraphFont">
     <w:name w:val="Default Paragraph Font"/>
     <w:uiPriority w:val="1"/>
+    <w:semiHidden/>
     <w:unhideWhenUsed/>
   </w:style>
   <w:style w:type="table" w:default="1" w:styleId="TableNormal">

</xml_diff>